<commit_message>
Building request text as an input; bigger stamp on Form 24, Project Description and Form 14
- «بناء فيلا جديدة في ارض خالية» in the new villa building request letter is now
  the "What is requested" input (default: the same text), in PDF and Word.
- The ACAD stamp on Form 24, the Project Description form and Form 14 is 105 pt
  (as on the Word letters) and the same size on every page.

Co-Authored-By: Claude Opus 5.5 <noreply@anthropic.com>
Claude-Session: https://claude.ai/code/session_01KhB95Q3CdNoHoGHNq4XQ7x
</commit_message>
<xml_diff>
--- a/templates/dist/bld-mun-building-request.docx
+++ b/templates/dist/bld-mun-building-request.docx
@@ -665,7 +665,35 @@
           <w:szCs w:val="32"/>
           <w:rtl/>
         </w:rPr>
-        <w:t xml:space="preserve">بالإشارة إلى الموضوع اعلاه وبناء على رغبة السيد المالك نرجو التكرم بالموافقة على بناء فيلا جديدة في ارض خالية </w:t>
+        <w:t xml:space="preserve">بالإشارة إلى الموضوع اعلاه وبناء على رغبة السيد المالك نرجو التكرم بالموافقة على ‏</w:t>
+      </w:r>
+      <w:r>
+        <w:rPr>
+          <w:sz w:val="32"/>
+          <w:szCs w:val="32"/>
+          <w:rtl/>
+        </w:rPr>
+        <w:br/>
+        <w:t> </w:t>
+      </w:r>
+      <w:r>
+        <w:rPr>
+          <w:rFonts w:cs="Times New Roman" w:ascii="Times New Roman" w:hAnsi="Times New Roman" w:eastAsia="Times New Roman"/>
+          <w:rtl/>
+          <w:color w:val="FFFFFF"/>
+          <w:spacing w:val="-20"/>
+          <w:sz w:val="2"/>
+          <w:szCs w:val="2"/>
+        </w:rPr>
+        <w:t xml:space="preserve">QZ6ZQ</w:t>
+      </w:r>
+      <w:r>
+        <w:rPr>
+          <w:sz w:val="32"/>
+          <w:szCs w:val="32"/>
+          <w:rtl/>
+        </w:rPr>
+        <w:t xml:space="preserve"> </w:t>
       </w:r>
     </w:p>
     <w:p>
@@ -902,7 +930,7 @@
           <w:sz w:val="2"/>
           <w:szCs w:val="2"/>
         </w:rPr>
-        <w:t xml:space="preserve">QZ6ZQ</w:t>
+        <w:t xml:space="preserve">QZ7ZQ</w:t>
       </w:r>
     </w:p>
     <w:p>

</xml_diff>